<commit_message>
feat: add teacher-admin bulk import workflow
</commit_message>
<xml_diff>
--- a/frontend/public/templates/question-bank-import-template.docx
+++ b/frontend/public/templates/question-bank-import-template.docx
@@ -3,89 +3,446 @@
 <w:document xmlns:wpc="http://schemas.microsoft.com/office/word/2010/wordprocessingCanvas" xmlns:mo="http://schemas.microsoft.com/office/mac/office/2008/main" xmlns:mc="http://schemas.openxmlformats.org/markup-compatibility/2006" xmlns:mv="urn:schemas-microsoft-com:mac:vml" xmlns:o="urn:schemas-microsoft-com:office:office" xmlns:r="http://schemas.openxmlformats.org/officeDocument/2006/relationships" xmlns:m="http://schemas.openxmlformats.org/officeDocument/2006/math" xmlns:v="urn:schemas-microsoft-com:vml" xmlns:wp14="http://schemas.microsoft.com/office/word/2010/wordprocessingDrawing" xmlns:wp="http://schemas.openxmlformats.org/drawingml/2006/wordprocessingDrawing" xmlns:w10="urn:schemas-microsoft-com:office:word" xmlns:w="http://schemas.openxmlformats.org/wordprocessingml/2006/main" xmlns:w14="http://schemas.microsoft.com/office/word/2010/wordml" xmlns:wpg="http://schemas.microsoft.com/office/word/2010/wordprocessingGroup" xmlns:wpi="http://schemas.microsoft.com/office/word/2010/wordprocessingInk" xmlns:wne="http://schemas.microsoft.com/office/word/2006/wordml" xmlns:wps="http://schemas.microsoft.com/office/word/2010/wordprocessingShape" mc:Ignorable="w14 wp14">
   <w:body>
     <w:p>
+      <w:pPr>
+        <w:spacing w:after="160"/>
+      </w:pPr>
       <w:r>
-        <w:t>QUESTION BANK</w:t>
+        <w:rPr>
+          <w:rFonts w:ascii="Calibri" w:hAnsi="Calibri"/>
+          <w:b/>
+          <w:color w:val="0F766E"/>
+          <w:sz w:val="36"/>
+        </w:rPr>
+        <w:t>Question Bank Import Template</w:t>
       </w:r>
     </w:p>
     <w:p>
+      <w:pPr>
+        <w:spacing w:after="160"/>
+      </w:pPr>
       <w:r>
-        <w:t>SUBJECT</w:t>
+        <w:t>Use this DOCX as a starting point. Replace the sample Subject, Chapter, Learning Objectives, and questions before upload. Save as DOCX, or export to a text-based PDF; scanned PDFs are not supported.</w:t>
       </w:r>
     </w:p>
     <w:p>
+      <w:pPr>
+        <w:spacing w:before="240" w:after="120"/>
+      </w:pPr>
       <w:r>
-        <w:t>Subject ID: DS310</w:t>
+        <w:rPr>
+          <w:rFonts w:ascii="Calibri" w:hAnsi="Calibri"/>
+          <w:b/>
+          <w:color w:val="2E74B5"/>
+          <w:sz w:val="26"/>
+        </w:rPr>
+        <w:t>How to prepare the import</w:t>
       </w:r>
     </w:p>
     <w:p>
+      <w:pPr>
+        <w:pStyle w:val="ListBullet"/>
+        <w:spacing w:after="80"/>
+      </w:pPr>
       <w:r>
-        <w:t>Subject Name: Fundamentals of Data Science</w:t>
+        <w:t>For Import Questions into an existing Subject, Subject ID must exactly match the selected Subject. Subject Name may differ only as a warning.</w:t>
       </w:r>
     </w:p>
     <w:p>
+      <w:pPr>
+        <w:pStyle w:val="ListBullet"/>
+        <w:spacing w:after="80"/>
+      </w:pPr>
       <w:r>
-        <w:t>Description: Sample subject description.</w:t>
-      </w:r>
-    </w:p>
-    <w:p/>
-    <w:p>
-      <w:r>
-        <w:t>CHAPTER: Introduction to Data Science</w:t>
+        <w:t>For Import New Subject, choose an unused Subject ID. Preview shows all creates and conflicts before any data is written.</w:t>
       </w:r>
     </w:p>
     <w:p>
+      <w:pPr>
+        <w:pStyle w:val="ListBullet"/>
+        <w:spacing w:after="80"/>
+      </w:pPr>
       <w:r>
+        <w:t>Each Chapter begins with CHAPTER: followed by its name. Learning Objectives use | between names. Existing unambiguous names are reused; new ones are created during import.</w:t>
+      </w:r>
+    </w:p>
+    <w:p>
+      <w:pPr>
+        <w:pStyle w:val="ListBullet"/>
+        <w:spacing w:after="80"/>
+      </w:pPr>
+      <w:r>
+        <w:t>Use Multiple Choice, True/False, or Essay. Difficulty must be Easy, Medium, or Hard. Question text and option text have a 255-character maximum.</w:t>
+      </w:r>
+    </w:p>
+    <w:p>
+      <w:pPr>
+        <w:pStyle w:val="ListBullet"/>
+        <w:spacing w:after="80"/>
+      </w:pPr>
+      <w:r>
+        <w:t>Multiple Choice needs two to six A-F options and Answer with one or more labels, such as B or A,C. True/False uses Answer: True or Answer: False and has no A-F options. Essay has neither options nor Answer.</w:t>
+      </w:r>
+    </w:p>
+    <w:p>
+      <w:pPr>
+        <w:spacing w:before="240" w:after="120"/>
+      </w:pPr>
+      <w:r>
+        <w:rPr>
+          <w:rFonts w:ascii="Calibri" w:hAnsi="Calibri"/>
+          <w:b/>
+          <w:color w:val="2E74B5"/>
+          <w:sz w:val="26"/>
+        </w:rPr>
+        <w:t>Editable example</w:t>
+      </w:r>
+    </w:p>
+    <w:p>
+      <w:pPr>
+        <w:spacing w:after="0" w:line="240" w:lineRule="auto"/>
+      </w:pPr>
+      <w:r>
+        <w:rPr>
+          <w:rFonts w:ascii="Consolas" w:hAnsi="Consolas"/>
+          <w:sz w:val="18"/>
+        </w:rPr>
+        <w:t>Question Bank</w:t>
+      </w:r>
+    </w:p>
+    <w:p>
+      <w:pPr>
+        <w:spacing w:after="0" w:line="240" w:lineRule="auto"/>
+      </w:pPr>
+      <w:r>
+        <w:rPr>
+          <w:rFonts w:ascii="Consolas" w:hAnsi="Consolas"/>
+          <w:sz w:val="18"/>
+        </w:rPr>
+      </w:r>
+    </w:p>
+    <w:p>
+      <w:pPr>
+        <w:spacing w:after="0" w:line="240" w:lineRule="auto"/>
+      </w:pPr>
+      <w:r>
+        <w:rPr>
+          <w:rFonts w:ascii="Consolas" w:hAnsi="Consolas"/>
+          <w:sz w:val="18"/>
+        </w:rPr>
+        <w:t>Subject ID: NEW_SUBJECT_ID</w:t>
+      </w:r>
+    </w:p>
+    <w:p>
+      <w:pPr>
+        <w:spacing w:after="0" w:line="240" w:lineRule="auto"/>
+      </w:pPr>
+      <w:r>
+        <w:rPr>
+          <w:rFonts w:ascii="Consolas" w:hAnsi="Consolas"/>
+          <w:sz w:val="18"/>
+        </w:rPr>
+        <w:t>Subject Name: New Subject Name</w:t>
+      </w:r>
+    </w:p>
+    <w:p>
+      <w:pPr>
+        <w:spacing w:after="0" w:line="240" w:lineRule="auto"/>
+      </w:pPr>
+      <w:r>
+        <w:rPr>
+          <w:rFonts w:ascii="Consolas" w:hAnsi="Consolas"/>
+          <w:sz w:val="18"/>
+        </w:rPr>
+        <w:t>Description: Brief subject description</w:t>
+      </w:r>
+    </w:p>
+    <w:p>
+      <w:pPr>
+        <w:spacing w:after="0" w:line="240" w:lineRule="auto"/>
+      </w:pPr>
+      <w:r>
+        <w:rPr>
+          <w:rFonts w:ascii="Consolas" w:hAnsi="Consolas"/>
+          <w:sz w:val="18"/>
+        </w:rPr>
+      </w:r>
+    </w:p>
+    <w:p>
+      <w:pPr>
+        <w:spacing w:after="0" w:line="240" w:lineRule="auto"/>
+      </w:pPr>
+      <w:r>
+        <w:rPr>
+          <w:rFonts w:ascii="Consolas" w:hAnsi="Consolas"/>
+          <w:sz w:val="18"/>
+        </w:rPr>
+        <w:t>CHAPTER: Chapter 1</w:t>
+      </w:r>
+    </w:p>
+    <w:p>
+      <w:pPr>
+        <w:spacing w:after="0" w:line="240" w:lineRule="auto"/>
+      </w:pPr>
+      <w:r>
+        <w:rPr>
+          <w:rFonts w:ascii="Consolas" w:hAnsi="Consolas"/>
+          <w:sz w:val="18"/>
+        </w:rPr>
+      </w:r>
+    </w:p>
+    <w:p>
+      <w:pPr>
+        <w:spacing w:after="0" w:line="240" w:lineRule="auto"/>
+      </w:pPr>
+      <w:r>
+        <w:rPr>
+          <w:rFonts w:ascii="Consolas" w:hAnsi="Consolas"/>
+          <w:sz w:val="18"/>
+        </w:rPr>
         <w:t>QUESTION 1</w:t>
       </w:r>
     </w:p>
     <w:p>
+      <w:pPr>
+        <w:spacing w:after="0" w:line="240" w:lineRule="auto"/>
+      </w:pPr>
       <w:r>
+        <w:rPr>
+          <w:rFonts w:ascii="Consolas" w:hAnsi="Consolas"/>
+          <w:sz w:val="18"/>
+        </w:rPr>
         <w:t>Type: Multiple Choice</w:t>
       </w:r>
     </w:p>
     <w:p>
+      <w:pPr>
+        <w:spacing w:after="0" w:line="240" w:lineRule="auto"/>
+      </w:pPr>
       <w:r>
+        <w:rPr>
+          <w:rFonts w:ascii="Consolas" w:hAnsi="Consolas"/>
+          <w:sz w:val="18"/>
+        </w:rPr>
         <w:t>Difficulty: Easy</w:t>
       </w:r>
     </w:p>
     <w:p>
+      <w:pPr>
+        <w:spacing w:after="0" w:line="240" w:lineRule="auto"/>
+      </w:pPr>
       <w:r>
-        <w:t>Learning Objectives: LO A | LO B</w:t>
+        <w:rPr>
+          <w:rFonts w:ascii="Consolas" w:hAnsi="Consolas"/>
+          <w:sz w:val="18"/>
+        </w:rPr>
+        <w:t>Learning Objectives: Learning objective 1 | Learning objective 2</w:t>
       </w:r>
     </w:p>
     <w:p>
+      <w:pPr>
+        <w:spacing w:after="0" w:line="240" w:lineRule="auto"/>
+      </w:pPr>
       <w:r>
-        <w:t>Content: Replace this with your question text.</w:t>
+        <w:rPr>
+          <w:rFonts w:ascii="Consolas" w:hAnsi="Consolas"/>
+          <w:sz w:val="18"/>
+        </w:rPr>
+        <w:t>Content: What is 2 + 2?</w:t>
       </w:r>
     </w:p>
     <w:p>
+      <w:pPr>
+        <w:spacing w:after="0" w:line="240" w:lineRule="auto"/>
+      </w:pPr>
       <w:r>
-        <w:t>A. First option</w:t>
+        <w:rPr>
+          <w:rFonts w:ascii="Consolas" w:hAnsi="Consolas"/>
+          <w:sz w:val="18"/>
+        </w:rPr>
+        <w:t>A. 3</w:t>
       </w:r>
     </w:p>
     <w:p>
+      <w:pPr>
+        <w:spacing w:after="0" w:line="240" w:lineRule="auto"/>
+      </w:pPr>
       <w:r>
-        <w:t>B. Correct option</w:t>
+        <w:rPr>
+          <w:rFonts w:ascii="Consolas" w:hAnsi="Consolas"/>
+          <w:sz w:val="18"/>
+        </w:rPr>
+        <w:t>B. 4</w:t>
       </w:r>
     </w:p>
     <w:p>
+      <w:pPr>
+        <w:spacing w:after="0" w:line="240" w:lineRule="auto"/>
+      </w:pPr>
       <w:r>
-        <w:t>C. Third option</w:t>
+        <w:rPr>
+          <w:rFonts w:ascii="Consolas" w:hAnsi="Consolas"/>
+          <w:sz w:val="18"/>
+        </w:rPr>
+        <w:t>Answer: B</w:t>
       </w:r>
     </w:p>
     <w:p>
+      <w:pPr>
+        <w:spacing w:after="0" w:line="240" w:lineRule="auto"/>
+      </w:pPr>
       <w:r>
-        <w:t>D. Fourth option</w:t>
+        <w:rPr>
+          <w:rFonts w:ascii="Consolas" w:hAnsi="Consolas"/>
+          <w:sz w:val="18"/>
+        </w:rPr>
       </w:r>
     </w:p>
     <w:p>
+      <w:pPr>
+        <w:spacing w:after="0" w:line="240" w:lineRule="auto"/>
+      </w:pPr>
       <w:r>
-        <w:t>Answer: B</w:t>
+        <w:rPr>
+          <w:rFonts w:ascii="Consolas" w:hAnsi="Consolas"/>
+          <w:sz w:val="18"/>
+        </w:rPr>
+        <w:t>QUESTION 2</w:t>
+      </w:r>
+    </w:p>
+    <w:p>
+      <w:pPr>
+        <w:spacing w:after="0" w:line="240" w:lineRule="auto"/>
+      </w:pPr>
+      <w:r>
+        <w:rPr>
+          <w:rFonts w:ascii="Consolas" w:hAnsi="Consolas"/>
+          <w:sz w:val="18"/>
+        </w:rPr>
+        <w:t>Type: True/False</w:t>
+      </w:r>
+    </w:p>
+    <w:p>
+      <w:pPr>
+        <w:spacing w:after="0" w:line="240" w:lineRule="auto"/>
+      </w:pPr>
+      <w:r>
+        <w:rPr>
+          <w:rFonts w:ascii="Consolas" w:hAnsi="Consolas"/>
+          <w:sz w:val="18"/>
+        </w:rPr>
+        <w:t>Difficulty: Medium</w:t>
+      </w:r>
+    </w:p>
+    <w:p>
+      <w:pPr>
+        <w:spacing w:after="0" w:line="240" w:lineRule="auto"/>
+      </w:pPr>
+      <w:r>
+        <w:rPr>
+          <w:rFonts w:ascii="Consolas" w:hAnsi="Consolas"/>
+          <w:sz w:val="18"/>
+        </w:rPr>
+        <w:t>Learning Objectives: Learning objective 1</w:t>
+      </w:r>
+    </w:p>
+    <w:p>
+      <w:pPr>
+        <w:spacing w:after="0" w:line="240" w:lineRule="auto"/>
+      </w:pPr>
+      <w:r>
+        <w:rPr>
+          <w:rFonts w:ascii="Consolas" w:hAnsi="Consolas"/>
+          <w:sz w:val="18"/>
+        </w:rPr>
+        <w:t>Content: The statement is true.</w:t>
+      </w:r>
+    </w:p>
+    <w:p>
+      <w:pPr>
+        <w:spacing w:after="0" w:line="240" w:lineRule="auto"/>
+      </w:pPr>
+      <w:r>
+        <w:rPr>
+          <w:rFonts w:ascii="Consolas" w:hAnsi="Consolas"/>
+          <w:sz w:val="18"/>
+        </w:rPr>
+        <w:t>Answer: True</w:t>
+      </w:r>
+    </w:p>
+    <w:p>
+      <w:pPr>
+        <w:spacing w:after="0" w:line="240" w:lineRule="auto"/>
+      </w:pPr>
+      <w:r>
+        <w:rPr>
+          <w:rFonts w:ascii="Consolas" w:hAnsi="Consolas"/>
+          <w:sz w:val="18"/>
+        </w:rPr>
+      </w:r>
+    </w:p>
+    <w:p>
+      <w:pPr>
+        <w:spacing w:after="0" w:line="240" w:lineRule="auto"/>
+      </w:pPr>
+      <w:r>
+        <w:rPr>
+          <w:rFonts w:ascii="Consolas" w:hAnsi="Consolas"/>
+          <w:sz w:val="18"/>
+        </w:rPr>
+        <w:t>QUESTION 3</w:t>
+      </w:r>
+    </w:p>
+    <w:p>
+      <w:pPr>
+        <w:spacing w:after="0" w:line="240" w:lineRule="auto"/>
+      </w:pPr>
+      <w:r>
+        <w:rPr>
+          <w:rFonts w:ascii="Consolas" w:hAnsi="Consolas"/>
+          <w:sz w:val="18"/>
+        </w:rPr>
+        <w:t>Type: Essay</w:t>
+      </w:r>
+    </w:p>
+    <w:p>
+      <w:pPr>
+        <w:spacing w:after="0" w:line="240" w:lineRule="auto"/>
+      </w:pPr>
+      <w:r>
+        <w:rPr>
+          <w:rFonts w:ascii="Consolas" w:hAnsi="Consolas"/>
+          <w:sz w:val="18"/>
+        </w:rPr>
+        <w:t>Difficulty: Hard</w:t>
+      </w:r>
+    </w:p>
+    <w:p>
+      <w:pPr>
+        <w:spacing w:after="0" w:line="240" w:lineRule="auto"/>
+      </w:pPr>
+      <w:r>
+        <w:rPr>
+          <w:rFonts w:ascii="Consolas" w:hAnsi="Consolas"/>
+          <w:sz w:val="18"/>
+        </w:rPr>
+        <w:t>Learning Objectives: Learning objective 2</w:t>
+      </w:r>
+    </w:p>
+    <w:p>
+      <w:pPr>
+        <w:spacing w:after="0" w:line="240" w:lineRule="auto"/>
+      </w:pPr>
+      <w:r>
+        <w:rPr>
+          <w:rFonts w:ascii="Consolas" w:hAnsi="Consolas"/>
+          <w:sz w:val="18"/>
+        </w:rPr>
+        <w:t>Content: Explain your reasoning.</w:t>
       </w:r>
     </w:p>
     <w:sectPr>
       <w:pgSz w:w="12240" w:h="15840"/>
-      <w:pgMar w:top="1440" w:right="1800" w:bottom="1440" w:left="1800" w:header="720" w:footer="720" w:gutter="0"/>
+      <w:pgMar w:top="1440" w:right="1440" w:bottom="1440" w:left="1440" w:header="720" w:footer="720" w:gutter="0"/>
       <w:cols w:space="720"/>
       <w:docGrid w:linePitch="360"/>
     </w:sectPr>
@@ -456,6 +813,10 @@
     <w:name w:val="Normal"/>
     <w:qFormat/>
     <w:rsid w:val="00FC693F"/>
+    <w:rPr>
+      <w:rFonts w:ascii="Calibri" w:hAnsi="Calibri"/>
+      <w:sz w:val="22"/>
+    </w:rPr>
   </w:style>
   <w:style w:type="paragraph" w:styleId="Header">
     <w:name w:val="header"/>

</xml_diff>